<commit_message>
Remove co-author references and recompile report/presentation
</commit_message>
<xml_diff>
--- a/paper/report.docx
+++ b/paper/report.docx
@@ -42,25 +42,7 @@
         <w:br/>
         <w:t>Email: vedant.jharia.btech2023@sitnagpur.siu.edu.in</w:t>
         <w:br/>
-        <w:br/>
-      </w:r>
-      <w:r>
-        <w:rPr>
-          <w:b/>
-          <w:sz w:val="22"/>
-        </w:rPr>
-        <w:t>[Co-Author / Team Member Name]</w:t>
-        <w:br/>
-      </w:r>
-      <w:r>
-        <w:rPr>
-          <w:sz w:val="19"/>
-        </w:rPr>
-        <w:t>PRN: [Insert PRN] | Course: Business Intelligence / Machine Learning Mini-Project (CA3)</w:t>
-        <w:br/>
-        <w:t>Symbiosis Institute of Technology, Nagpur</w:t>
-        <w:br/>
-        <w:t>Symbiosis International (Deemed University), Pune, India</w:t>
+        <w:t>Course: Business Intelligence / Machine Learning Mini-Project (CA3)</w:t>
       </w:r>
     </w:p>
     <w:p>

</xml_diff>